<commit_message>
adding links to the inform
</commit_message>
<xml_diff>
--- a/docs/Actividad 2 Test Configuration.docx
+++ b/docs/Actividad 2 Test Configuration.docx
@@ -63,18 +63,219 @@
     </w:p>
     <w:p/>
     <w:p>
-      <w:r>
+      <w:pPr>
+        <w:jc w:val="left"/>
+        <w:rPr>
+          <w:b/>
+          <w:bCs/>
+          <w:lang w:val="en-US"/>
+        </w:rPr>
+      </w:pPr>
+      <w:r>
+        <w:rPr>
+          <w:b/>
+          <w:bCs/>
+          <w:lang w:val="en-US"/>
+        </w:rPr>
         <w:t>URL PROD</w:t>
+      </w:r>
+      <w:r>
+        <w:rPr>
+          <w:b/>
+          <w:bCs/>
+          <w:lang w:val="en-US"/>
+        </w:rPr>
+        <w:t>:</w:t>
+      </w:r>
+      <w:r>
+        <w:rPr>
+          <w:b/>
+          <w:bCs/>
+          <w:lang w:val="en-US"/>
+        </w:rPr>
+        <w:t xml:space="preserve"> </w:t>
+      </w:r>
+      <w:hyperlink r:id="rId11" w:history="1">
+        <w:r>
+          <w:rPr>
+            <w:rStyle w:val="Hyperlink"/>
+            <w:b/>
+            <w:bCs/>
+            <w:lang w:val="en-US"/>
+          </w:rPr>
+          <w:t>https://latamtradex-actividad</w:t>
+        </w:r>
+        <w:r>
+          <w:rPr>
+            <w:rStyle w:val="Hyperlink"/>
+            <w:b/>
+            <w:bCs/>
+            <w:lang w:val="en-US"/>
+          </w:rPr>
+          <w:t>2</w:t>
+        </w:r>
+        <w:r>
+          <w:rPr>
+            <w:rStyle w:val="Hyperlink"/>
+            <w:b/>
+            <w:bCs/>
+            <w:lang w:val="en-US"/>
+          </w:rPr>
+          <w:t>.</w:t>
+        </w:r>
+        <w:r>
+          <w:rPr>
+            <w:rStyle w:val="Hyperlink"/>
+            <w:b/>
+            <w:bCs/>
+            <w:lang w:val="en-US"/>
+          </w:rPr>
+          <w:t>azucarsintactica.com/?demo=1</w:t>
+        </w:r>
+      </w:hyperlink>
+      <w:r>
+        <w:rPr>
+          <w:b/>
+          <w:bCs/>
+          <w:lang w:val="en-US"/>
+        </w:rPr>
+        <w:br/>
       </w:r>
     </w:p>
     <w:p>
-      <w:r>
+      <w:pPr>
+        <w:jc w:val="left"/>
+        <w:rPr>
+          <w:b/>
+          <w:bCs/>
+          <w:lang w:val="en-US"/>
+        </w:rPr>
+      </w:pPr>
+      <w:r>
+        <w:rPr>
+          <w:b/>
+          <w:bCs/>
+          <w:lang w:val="en-US"/>
+        </w:rPr>
         <w:t>GITHUB</w:t>
       </w:r>
+      <w:r>
+        <w:rPr>
+          <w:b/>
+          <w:bCs/>
+          <w:lang w:val="en-US"/>
+        </w:rPr>
+        <w:t>:</w:t>
+      </w:r>
+      <w:r>
+        <w:rPr>
+          <w:b/>
+          <w:bCs/>
+          <w:lang w:val="en-US"/>
+        </w:rPr>
+        <w:t xml:space="preserve"> </w:t>
+      </w:r>
+      <w:hyperlink r:id="rId12" w:history="1">
+        <w:r>
+          <w:rPr>
+            <w:rStyle w:val="Hyperlink"/>
+            <w:b/>
+            <w:bCs/>
+            <w:lang w:val="en-US"/>
+          </w:rPr>
+          <w:t>https://github.com/jua</w:t>
+        </w:r>
+        <w:r>
+          <w:rPr>
+            <w:rStyle w:val="Hyperlink"/>
+            <w:b/>
+            <w:bCs/>
+            <w:lang w:val="en-US"/>
+          </w:rPr>
+          <w:t>n</w:t>
+        </w:r>
+        <w:r>
+          <w:rPr>
+            <w:rStyle w:val="Hyperlink"/>
+            <w:b/>
+            <w:bCs/>
+            <w:lang w:val="en-US"/>
+          </w:rPr>
+          <w:t>k704/latamtradex-generativecode/tree/feature/test-activity-2</w:t>
+        </w:r>
+      </w:hyperlink>
     </w:p>
     <w:p>
-      <w:r>
+      <w:pPr>
+        <w:jc w:val="left"/>
+        <w:rPr>
+          <w:b/>
+          <w:bCs/>
+          <w:lang w:val="en-US"/>
+        </w:rPr>
+      </w:pPr>
+    </w:p>
+    <w:p>
+      <w:pPr>
+        <w:jc w:val="left"/>
+        <w:rPr>
+          <w:b/>
+          <w:bCs/>
+        </w:rPr>
+      </w:pPr>
+      <w:r>
+        <w:rPr>
+          <w:b/>
+          <w:bCs/>
+        </w:rPr>
         <w:t>DOCUMENTACION IA</w:t>
+      </w:r>
+      <w:r>
+        <w:rPr>
+          <w:b/>
+          <w:bCs/>
+        </w:rPr>
+        <w:t>:</w:t>
+      </w:r>
+      <w:r>
+        <w:rPr>
+          <w:b/>
+          <w:bCs/>
+        </w:rPr>
+        <w:t xml:space="preserve"> </w:t>
+      </w:r>
+      <w:hyperlink r:id="rId13" w:history="1">
+        <w:r>
+          <w:rPr>
+            <w:rStyle w:val="Hyperlink"/>
+            <w:b/>
+            <w:bCs/>
+          </w:rPr>
+          <w:t>https://gith</w:t>
+        </w:r>
+        <w:r>
+          <w:rPr>
+            <w:rStyle w:val="Hyperlink"/>
+            <w:b/>
+            <w:bCs/>
+          </w:rPr>
+          <w:t>u</w:t>
+        </w:r>
+        <w:r>
+          <w:rPr>
+            <w:rStyle w:val="Hyperlink"/>
+            <w:b/>
+            <w:bCs/>
+          </w:rPr>
+          <w:t>b.com/juank704/latamtradex-generativecode/blob/feature/test-activity-2/docs/registro_prompts_actividad_2.txt</w:t>
+        </w:r>
+      </w:hyperlink>
+      <w:r>
+        <w:rPr>
+          <w:b/>
+          <w:bCs/>
+        </w:rPr>
+        <w:br/>
       </w:r>
     </w:p>
     <w:p/>
@@ -170,6 +371,7 @@
           <w:b/>
           <w:bCs/>
         </w:rPr>
+        <w:lastRenderedPageBreak/>
         <w:t>Máquina de Estados de la Orden de Compra:</w:t>
       </w:r>
       <w:r>
@@ -276,11 +478,7 @@
         <w:t>:</w:t>
       </w:r>
       <w:r>
-        <w:t xml:space="preserve"> Se implementó una suite de pruebas de interfaz de usuario y flujos completos simulando el </w:t>
-      </w:r>
-      <w:r>
-        <w:lastRenderedPageBreak/>
-        <w:t xml:space="preserve">comportamiento real de los usuarios en el navegador. Se evaluó el "Happy Path" completo: desde que un proveedor publica un producto, el administrador lo aprueba, el comprador solicita cotización, hasta la generación de la Orden de Compra y su seguimiento interactivo, ejecutando todo de forma </w:t>
+        <w:t xml:space="preserve"> Se implementó una suite de pruebas de interfaz de usuario y flujos completos simulando el comportamiento real de los usuarios en el navegador. Se evaluó el "Happy Path" completo: desde que un proveedor publica un producto, el administrador lo aprueba, el comprador solicita cotización, hasta la generación de la Orden de Compra y su seguimiento interactivo, ejecutando todo de forma </w:t>
       </w:r>
       <w:proofErr w:type="spellStart"/>
       <w:r>
@@ -297,12 +495,26 @@
     </w:p>
     <w:p/>
     <w:p/>
+    <w:p/>
+    <w:p/>
+    <w:p/>
+    <w:p/>
+    <w:p/>
+    <w:p/>
+    <w:p/>
+    <w:p/>
+    <w:p/>
+    <w:p/>
+    <w:p/>
+    <w:p/>
+    <w:p/>
     <w:p>
       <w:r>
         <w:rPr>
           <w:b/>
           <w:bCs/>
         </w:rPr>
+        <w:lastRenderedPageBreak/>
         <w:t>Capturas y logs de ejecución</w:t>
       </w:r>
     </w:p>
@@ -332,7 +544,7 @@
                     </pic:cNvPicPr>
                   </pic:nvPicPr>
                   <pic:blipFill>
-                    <a:blip r:embed="rId11" cstate="print">
+                    <a:blip r:embed="rId14" cstate="print">
                       <a:extLst>
                         <a:ext uri="{28A0092B-C50C-407E-A947-70E740481C1C}">
                           <a14:useLocalDpi xmlns:a14="http://schemas.microsoft.com/office/drawing/2010/main" val="0"/>
@@ -367,7 +579,6 @@
         <w:rPr>
           <w:noProof/>
         </w:rPr>
-        <w:lastRenderedPageBreak/>
         <w:drawing>
           <wp:inline distT="0" distB="0" distL="0" distR="0" wp14:anchorId="2DA983ED" wp14:editId="31F1B3D4">
             <wp:extent cx="5204460" cy="3147060"/>
@@ -386,7 +597,7 @@
                     </pic:cNvPicPr>
                   </pic:nvPicPr>
                   <pic:blipFill>
-                    <a:blip r:embed="rId12" cstate="print">
+                    <a:blip r:embed="rId15" cstate="print">
                       <a:extLst>
                         <a:ext uri="{28A0092B-C50C-407E-A947-70E740481C1C}">
                           <a14:useLocalDpi xmlns:a14="http://schemas.microsoft.com/office/drawing/2010/main" val="0"/>
@@ -421,6 +632,7 @@
         <w:rPr>
           <w:noProof/>
         </w:rPr>
+        <w:lastRenderedPageBreak/>
         <w:drawing>
           <wp:inline distT="0" distB="0" distL="0" distR="0" wp14:anchorId="620944F3" wp14:editId="3F40BF25">
             <wp:extent cx="5212080" cy="3139440"/>
@@ -439,7 +651,7 @@
                     </pic:cNvPicPr>
                   </pic:nvPicPr>
                   <pic:blipFill>
-                    <a:blip r:embed="rId13" cstate="print">
+                    <a:blip r:embed="rId16" cstate="print">
                       <a:extLst>
                         <a:ext uri="{28A0092B-C50C-407E-A947-70E740481C1C}">
                           <a14:useLocalDpi xmlns:a14="http://schemas.microsoft.com/office/drawing/2010/main" val="0"/>
@@ -494,11 +706,7 @@
       <w:proofErr w:type="spellEnd"/>
       <w:proofErr w:type="gramEnd"/>
       <w:r>
-        <w:t xml:space="preserve">. Se observa que las 40 pruebas de las 4 suites pasaron con éxito (100%), alcanzando una cobertura de código </w:t>
-      </w:r>
-      <w:r>
-        <w:lastRenderedPageBreak/>
-        <w:t>excelente en los archivos críticos de lógica de negocio (</w:t>
+        <w:t>. Se observa que las 40 pruebas de las 4 suites pasaron con éxito (100%), alcanzando una cobertura de código excelente en los archivos críticos de lógica de negocio (</w:t>
       </w:r>
       <w:proofErr w:type="spellStart"/>
       <w:r>
@@ -555,6 +763,7 @@
           <w:iCs/>
           <w:noProof/>
         </w:rPr>
+        <w:lastRenderedPageBreak/>
         <w:drawing>
           <wp:inline distT="0" distB="0" distL="0" distR="0" wp14:anchorId="7BE6D6E7" wp14:editId="180136C8">
             <wp:extent cx="5212080" cy="3002280"/>
@@ -573,7 +782,7 @@
                     </pic:cNvPicPr>
                   </pic:nvPicPr>
                   <pic:blipFill>
-                    <a:blip r:embed="rId14">
+                    <a:blip r:embed="rId17">
                       <a:extLst>
                         <a:ext uri="{28A0092B-C50C-407E-A947-70E740481C1C}">
                           <a14:useLocalDpi xmlns:a14="http://schemas.microsoft.com/office/drawing/2010/main" val="0"/>
@@ -669,7 +878,7 @@
                     </pic:cNvPicPr>
                   </pic:nvPicPr>
                   <pic:blipFill>
-                    <a:blip r:embed="rId15">
+                    <a:blip r:embed="rId18">
                       <a:extLst>
                         <a:ext uri="{28A0092B-C50C-407E-A947-70E740481C1C}">
                           <a14:useLocalDpi xmlns:a14="http://schemas.microsoft.com/office/drawing/2010/main" val="0"/>
@@ -729,6 +938,10 @@
     <w:p/>
     <w:p/>
     <w:p/>
+    <w:p/>
+    <w:p/>
+    <w:p/>
+    <w:p/>
     <w:p>
       <w:pPr>
         <w:pStyle w:val="TtuloApartado3"/>
@@ -1333,8 +1546,8 @@
       </w:pPr>
     </w:p>
     <w:sectPr>
-      <w:headerReference w:type="default" r:id="rId16"/>
-      <w:footerReference w:type="default" r:id="rId17"/>
+      <w:headerReference w:type="default" r:id="rId19"/>
+      <w:footerReference w:type="default" r:id="rId20"/>
       <w:pgSz w:w="11906" w:h="16838" w:code="9"/>
       <w:pgMar w:top="1418" w:right="1843" w:bottom="1418" w:left="1843" w:header="1134" w:footer="397" w:gutter="0"/>
       <w:cols w:space="708"/>
@@ -4664,6 +4877,18 @@
       <w:sz w:val="20"/>
       <w:szCs w:val="20"/>
       <w:lang w:val="en-IE" w:eastAsia="es-ES"/>
+    </w:rPr>
+  </w:style>
+  <w:style w:type="character" w:styleId="FollowedHyperlink">
+    <w:name w:val="FollowedHyperlink"/>
+    <w:basedOn w:val="DefaultParagraphFont"/>
+    <w:uiPriority w:val="99"/>
+    <w:semiHidden/>
+    <w:unhideWhenUsed/>
+    <w:rsid w:val="009665E3"/>
+    <w:rPr>
+      <w:color w:val="954F72" w:themeColor="followedHyperlink"/>
+      <w:u w:val="single"/>
     </w:rPr>
   </w:style>
 </w:styles>

</xml_diff>